<commit_message>
Update to v4.2.0 — sync files from driftcore_v4.2.0.zip
New files:
- CHANGELOG.md
- DRIFTCORE.md
- REVIEW_PHASE_B.md
- driftcore/memory/vector.py
- driftcore/verification/calibration_cases.json
- driftcore/verification/coordinator.py
- driftcore/verification/governed_actuator.py
- driftcore/verification/intent.py
- driftcore/verification/invariant_guard.py
- driftcore/verification/risk_classifier.py
- scripts/count_tests.sh
- test_governed_actuator.py
- test_intent_governance.py
- test_invariant_guard.py
- test_risk_classifier.py
- test_vector_memory.py

Updated files:
- CLAUDE.md
- CONSTITUTION.md
- CONTRIBUTING.md
- COPYING
- LICENSE
- README.md
- SAFETY_CONTRACT.md
- docs/DriftCore_Technical_Architecture.docx
- driftcore/__init__.py
- driftcore/verification/__init__.py
- stages/03_safety_review/CONTEXT.md
</commit_message>
<xml_diff>
--- a/docs/DriftCore_Technical_Architecture.docx
+++ b/docs/DriftCore_Technical_Architecture.docx
@@ -16,7 +16,7 @@
           <w:sz w:val="48"/>
           <w:szCs w:val="48"/>
         </w:rPr>
-        <w:t xml:space="preserve">DriftCore OS v3.9</w:t>
+        <w:t xml:space="preserve">DriftCore OS v4.2.0</w:t>
       </w:r>
     </w:p>
     <w:p>
@@ -48,7 +48,7 @@
           <w:sz w:val="20"/>
           <w:szCs w:val="20"/>
         </w:rPr>
-        <w:t xml:space="preserve">343 Tests  |  8 Safety Modules  |  Open Source</w:t>
+        <w:t xml:space="preserve">569 Tests  |  12 Safety Modules  |  Open Source</w:t>
       </w:r>
     </w:p>
     <w:p>
@@ -178,7 +178,7 @@
           <w:sz w:val="22"/>
           <w:szCs w:val="22"/>
         </w:rPr>
-        <w:t xml:space="preserve">DriftCore v3.9 comprises eight production modules with 343 automated tests:</w:t>
+        <w:t xml:space="preserve">DriftCore v4.2.0 comprises twelve production modules with 569 automated tests:</w:t>
       </w:r>
     </w:p>
     <w:tbl>
@@ -377,7 +377,7 @@
                 <w:sz w:val="20"/>
                 <w:szCs w:val="20"/>
               </w:rPr>
-              <w:t xml:space="preserve">15 + 49</w:t>
+              <w:t xml:space="preserve">15 + 35</w:t>
             </w:r>
           </w:p>
         </w:tc>
@@ -1005,7 +1005,379 @@
           </w:p>
         </w:tc>
       </w:tr>
+      <w:tr>
+        <w:tc>
+          <w:tcPr>
+            <w:tcW w:type="dxa" w:w="2400"/>
+            <w:tcBorders>
+              <w:top w:val="single" w:color="CCCCCC" w:sz="1"/>
+              <w:left w:val="single" w:color="CCCCCC" w:sz="1"/>
+              <w:bottom w:val="single" w:color="CCCCCC" w:sz="1"/>
+              <w:right w:val="single" w:color="CCCCCC" w:sz="1"/>
+            </w:tcBorders>
+            <w:shd w:fill="F2F9FF" w:val="clear"/>
+            <w:tcMar>
+              <w:top w:type="dxa" w:w="80"/>
+              <w:left w:type="dxa" w:w="120"/>
+              <w:bottom w:type="dxa" w:w="80"/>
+              <w:right w:type="dxa" w:w="120"/>
+            </w:tcMar>
+          </w:tcPr>
+          <w:p>
+            <w:r>
+              <w:rPr>
+                <w:rFonts w:ascii="Arial" w:cs="Arial" w:eastAsia="Arial" w:hAnsi="Arial"/>
+                <w:b/>
+                <w:bCs/>
+                <w:color w:val="1B4F72"/>
+                <w:sz w:val="20"/>
+                <w:szCs w:val="20"/>
+              </w:rPr>
+              <w:t xml:space="preserve">api</w:t>
+            </w:r>
+          </w:p>
+        </w:tc>
+        <w:tc>
+          <w:tcPr>
+            <w:tcW w:type="dxa" w:w="3960"/>
+            <w:tcBorders>
+              <w:top w:val="single" w:color="CCCCCC" w:sz="1"/>
+              <w:left w:val="single" w:color="CCCCCC" w:sz="1"/>
+              <w:bottom w:val="single" w:color="CCCCCC" w:sz="1"/>
+              <w:right w:val="single" w:color="CCCCCC" w:sz="1"/>
+            </w:tcBorders>
+            <w:shd w:fill="FFFFFF" w:val="clear"/>
+            <w:tcMar>
+              <w:top w:type="dxa" w:w="80"/>
+              <w:left w:type="dxa" w:w="120"/>
+              <w:bottom w:type="dxa" w:w="80"/>
+              <w:right w:type="dxa" w:w="120"/>
+            </w:tcMar>
+          </w:tcPr>
+          <w:p>
+            <w:r>
+              <w:rPr>
+                <w:rFonts w:ascii="Arial" w:cs="Arial" w:eastAsia="Arial" w:hAnsi="Arial"/>
+                <w:sz w:val="20"/>
+                <w:szCs w:val="20"/>
+              </w:rPr>
+              <w:t xml:space="preserve">Universal agent/device interface — every action audited, every write gated</w:t>
+            </w:r>
+          </w:p>
+        </w:tc>
+        <w:tc>
+          <w:tcPr>
+            <w:tcW w:type="dxa" w:w="3000"/>
+            <w:tcBorders>
+              <w:top w:val="single" w:color="CCCCCC" w:sz="1"/>
+              <w:left w:val="single" w:color="CCCCCC" w:sz="1"/>
+              <w:bottom w:val="single" w:color="CCCCCC" w:sz="1"/>
+              <w:right w:val="single" w:color="CCCCCC" w:sz="1"/>
+            </w:tcBorders>
+            <w:shd w:fill="FFFFFF" w:val="clear"/>
+            <w:tcMar>
+              <w:top w:type="dxa" w:w="80"/>
+              <w:left w:type="dxa" w:w="120"/>
+              <w:bottom w:type="dxa" w:w="80"/>
+              <w:right w:type="dxa" w:w="120"/>
+            </w:tcMar>
+          </w:tcPr>
+          <w:p>
+            <w:r>
+              <w:rPr>
+                <w:rFonts w:ascii="Arial" w:cs="Arial" w:eastAsia="Arial" w:hAnsi="Arial"/>
+                <w:sz w:val="20"/>
+                <w:szCs w:val="20"/>
+              </w:rPr>
+              <w:t xml:space="preserve">36</w:t>
+            </w:r>
+          </w:p>
+        </w:tc>
+      </w:tr>
+      <w:tr>
+        <w:tc>
+          <w:tcPr>
+            <w:tcW w:type="dxa" w:w="2400"/>
+            <w:tcBorders>
+              <w:top w:val="single" w:color="CCCCCC" w:sz="1"/>
+              <w:left w:val="single" w:color="CCCCCC" w:sz="1"/>
+              <w:bottom w:val="single" w:color="CCCCCC" w:sz="1"/>
+              <w:right w:val="single" w:color="CCCCCC" w:sz="1"/>
+            </w:tcBorders>
+            <w:shd w:fill="F2F9FF" w:val="clear"/>
+            <w:tcMar>
+              <w:top w:type="dxa" w:w="80"/>
+              <w:left w:type="dxa" w:w="120"/>
+              <w:bottom w:type="dxa" w:w="80"/>
+              <w:right w:type="dxa" w:w="120"/>
+            </w:tcMar>
+          </w:tcPr>
+          <w:p>
+            <w:r>
+              <w:rPr>
+                <w:rFonts w:ascii="Arial" w:cs="Arial" w:eastAsia="Arial" w:hAnsi="Arial"/>
+                <w:b/>
+                <w:bCs/>
+                <w:color w:val="1B4F72"/>
+                <w:sz w:val="20"/>
+                <w:szCs w:val="20"/>
+              </w:rPr>
+              <w:t xml:space="preserve">profiles</w:t>
+            </w:r>
+          </w:p>
+        </w:tc>
+        <w:tc>
+          <w:tcPr>
+            <w:tcW w:type="dxa" w:w="3960"/>
+            <w:tcBorders>
+              <w:top w:val="single" w:color="CCCCCC" w:sz="1"/>
+              <w:left w:val="single" w:color="CCCCCC" w:sz="1"/>
+              <w:bottom w:val="single" w:color="CCCCCC" w:sz="1"/>
+              <w:right w:val="single" w:color="CCCCCC" w:sz="1"/>
+            </w:tcBorders>
+            <w:shd w:fill="FFFFFF" w:val="clear"/>
+            <w:tcMar>
+              <w:top w:type="dxa" w:w="80"/>
+              <w:left w:type="dxa" w:w="120"/>
+              <w:bottom w:type="dxa" w:w="80"/>
+              <w:right w:type="dxa" w:w="120"/>
+            </w:tcMar>
+          </w:tcPr>
+          <w:p>
+            <w:r>
+              <w:rPr>
+                <w:rFonts w:ascii="Arial" w:cs="Arial" w:eastAsia="Arial" w:hAnsi="Arial"/>
+                <w:sz w:val="20"/>
+                <w:szCs w:val="20"/>
+              </w:rPr>
+              <w:t xml:space="preserve">Deployment profiles per context (home, medical, call center, accounting, admin)</w:t>
+            </w:r>
+          </w:p>
+        </w:tc>
+        <w:tc>
+          <w:tcPr>
+            <w:tcW w:type="dxa" w:w="3000"/>
+            <w:tcBorders>
+              <w:top w:val="single" w:color="CCCCCC" w:sz="1"/>
+              <w:left w:val="single" w:color="CCCCCC" w:sz="1"/>
+              <w:bottom w:val="single" w:color="CCCCCC" w:sz="1"/>
+              <w:right w:val="single" w:color="CCCCCC" w:sz="1"/>
+            </w:tcBorders>
+            <w:shd w:fill="FFFFFF" w:val="clear"/>
+            <w:tcMar>
+              <w:top w:type="dxa" w:w="80"/>
+              <w:left w:type="dxa" w:w="120"/>
+              <w:bottom w:type="dxa" w:w="80"/>
+              <w:right w:type="dxa" w:w="120"/>
+            </w:tcMar>
+          </w:tcPr>
+          <w:p>
+            <w:r>
+              <w:rPr>
+                <w:rFonts w:ascii="Arial" w:cs="Arial" w:eastAsia="Arial" w:hAnsi="Arial"/>
+                <w:sz w:val="20"/>
+                <w:szCs w:val="20"/>
+              </w:rPr>
+              <w:t xml:space="preserve">48*</w:t>
+            </w:r>
+          </w:p>
+        </w:tc>
+      </w:tr>
+      <w:tr>
+        <w:tc>
+          <w:tcPr>
+            <w:tcW w:type="dxa" w:w="2400"/>
+            <w:tcBorders>
+              <w:top w:val="single" w:color="CCCCCC" w:sz="1"/>
+              <w:left w:val="single" w:color="CCCCCC" w:sz="1"/>
+              <w:bottom w:val="single" w:color="CCCCCC" w:sz="1"/>
+              <w:right w:val="single" w:color="CCCCCC" w:sz="1"/>
+            </w:tcBorders>
+            <w:shd w:fill="F2F9FF" w:val="clear"/>
+            <w:tcMar>
+              <w:top w:type="dxa" w:w="80"/>
+              <w:left w:type="dxa" w:w="120"/>
+              <w:bottom w:type="dxa" w:w="80"/>
+              <w:right w:type="dxa" w:w="120"/>
+            </w:tcMar>
+          </w:tcPr>
+          <w:p>
+            <w:r>
+              <w:rPr>
+                <w:rFonts w:ascii="Arial" w:cs="Arial" w:eastAsia="Arial" w:hAnsi="Arial"/>
+                <w:b/>
+                <w:bCs/>
+                <w:color w:val="1B4F72"/>
+                <w:sz w:val="20"/>
+                <w:szCs w:val="20"/>
+              </w:rPr>
+              <w:t xml:space="preserve">feedback</w:t>
+            </w:r>
+          </w:p>
+        </w:tc>
+        <w:tc>
+          <w:tcPr>
+            <w:tcW w:type="dxa" w:w="3960"/>
+            <w:tcBorders>
+              <w:top w:val="single" w:color="CCCCCC" w:sz="1"/>
+              <w:left w:val="single" w:color="CCCCCC" w:sz="1"/>
+              <w:bottom w:val="single" w:color="CCCCCC" w:sz="1"/>
+              <w:right w:val="single" w:color="CCCCCC" w:sz="1"/>
+            </w:tcBorders>
+            <w:shd w:fill="FFFFFF" w:val="clear"/>
+            <w:tcMar>
+              <w:top w:type="dxa" w:w="80"/>
+              <w:left w:type="dxa" w:w="120"/>
+              <w:bottom w:type="dxa" w:w="80"/>
+              <w:right w:type="dxa" w:w="120"/>
+            </w:tcMar>
+          </w:tcPr>
+          <w:p>
+            <w:r>
+              <w:rPr>
+                <w:rFonts w:ascii="Arial" w:cs="Arial" w:eastAsia="Arial" w:hAnsi="Arial"/>
+                <w:sz w:val="20"/>
+                <w:szCs w:val="20"/>
+              </w:rPr>
+              <w:t xml:space="preserve">Bottom-up user feedback loop; admin approves changes</w:t>
+            </w:r>
+          </w:p>
+        </w:tc>
+        <w:tc>
+          <w:tcPr>
+            <w:tcW w:type="dxa" w:w="3000"/>
+            <w:tcBorders>
+              <w:top w:val="single" w:color="CCCCCC" w:sz="1"/>
+              <w:left w:val="single" w:color="CCCCCC" w:sz="1"/>
+              <w:bottom w:val="single" w:color="CCCCCC" w:sz="1"/>
+              <w:right w:val="single" w:color="CCCCCC" w:sz="1"/>
+            </w:tcBorders>
+            <w:shd w:fill="FFFFFF" w:val="clear"/>
+            <w:tcMar>
+              <w:top w:type="dxa" w:w="80"/>
+              <w:left w:type="dxa" w:w="120"/>
+              <w:bottom w:type="dxa" w:w="80"/>
+              <w:right w:type="dxa" w:w="120"/>
+            </w:tcMar>
+          </w:tcPr>
+          <w:p>
+            <w:r>
+              <w:rPr>
+                <w:rFonts w:ascii="Arial" w:cs="Arial" w:eastAsia="Arial" w:hAnsi="Arial"/>
+                <w:sz w:val="20"/>
+                <w:szCs w:val="20"/>
+              </w:rPr>
+              <w:t xml:space="preserve">shared*</w:t>
+            </w:r>
+          </w:p>
+        </w:tc>
+      </w:tr>
+      <w:tr>
+        <w:tc>
+          <w:tcPr>
+            <w:tcW w:type="dxa" w:w="2400"/>
+            <w:tcBorders>
+              <w:top w:val="single" w:color="CCCCCC" w:sz="1"/>
+              <w:left w:val="single" w:color="CCCCCC" w:sz="1"/>
+              <w:bottom w:val="single" w:color="CCCCCC" w:sz="1"/>
+              <w:right w:val="single" w:color="CCCCCC" w:sz="1"/>
+            </w:tcBorders>
+            <w:shd w:fill="F2F9FF" w:val="clear"/>
+            <w:tcMar>
+              <w:top w:type="dxa" w:w="80"/>
+              <w:left w:type="dxa" w:w="120"/>
+              <w:bottom w:type="dxa" w:w="80"/>
+              <w:right w:type="dxa" w:w="120"/>
+            </w:tcMar>
+          </w:tcPr>
+          <w:p>
+            <w:r>
+              <w:rPr>
+                <w:rFonts w:ascii="Arial" w:cs="Arial" w:eastAsia="Arial" w:hAnsi="Arial"/>
+                <w:b/>
+                <w:bCs/>
+                <w:color w:val="1B4F72"/>
+                <w:sz w:val="20"/>
+                <w:szCs w:val="20"/>
+              </w:rPr>
+              <w:t xml:space="preserve">verification</w:t>
+            </w:r>
+          </w:p>
+        </w:tc>
+        <w:tc>
+          <w:tcPr>
+            <w:tcW w:type="dxa" w:w="3960"/>
+            <w:tcBorders>
+              <w:top w:val="single" w:color="CCCCCC" w:sz="1"/>
+              <w:left w:val="single" w:color="CCCCCC" w:sz="1"/>
+              <w:bottom w:val="single" w:color="CCCCCC" w:sz="1"/>
+              <w:right w:val="single" w:color="CCCCCC" w:sz="1"/>
+            </w:tcBorders>
+            <w:shd w:fill="FFFFFF" w:val="clear"/>
+            <w:tcMar>
+              <w:top w:type="dxa" w:w="80"/>
+              <w:left w:type="dxa" w:w="120"/>
+              <w:bottom w:type="dxa" w:w="80"/>
+              <w:right w:type="dxa" w:w="120"/>
+            </w:tcMar>
+          </w:tcPr>
+          <w:p>
+            <w:r>
+              <w:rPr>
+                <w:rFonts w:ascii="Arial" w:cs="Arial" w:eastAsia="Arial" w:hAnsi="Arial"/>
+                <w:sz w:val="20"/>
+                <w:szCs w:val="20"/>
+              </w:rPr>
+              <w:t xml:space="preserve">Risk classification, intent, guard, coordinator, governed actuator; explainable, evasion-tested</w:t>
+            </w:r>
+          </w:p>
+        </w:tc>
+        <w:tc>
+          <w:tcPr>
+            <w:tcW w:type="dxa" w:w="3000"/>
+            <w:tcBorders>
+              <w:top w:val="single" w:color="CCCCCC" w:sz="1"/>
+              <w:left w:val="single" w:color="CCCCCC" w:sz="1"/>
+              <w:bottom w:val="single" w:color="CCCCCC" w:sz="1"/>
+              <w:right w:val="single" w:color="CCCCCC" w:sz="1"/>
+            </w:tcBorders>
+            <w:shd w:fill="FFFFFF" w:val="clear"/>
+            <w:tcMar>
+              <w:top w:type="dxa" w:w="80"/>
+              <w:left w:type="dxa" w:w="120"/>
+              <w:bottom w:type="dxa" w:w="80"/>
+              <w:right w:type="dxa" w:w="120"/>
+            </w:tcMar>
+          </w:tcPr>
+          <w:p>
+            <w:r>
+              <w:rPr>
+                <w:rFonts w:ascii="Arial" w:cs="Arial" w:eastAsia="Arial" w:hAnsi="Arial"/>
+                <w:sz w:val="20"/>
+                <w:szCs w:val="20"/>
+              </w:rPr>
+              <w:t xml:space="preserve">59 + 39 + 42 + 16</w:t>
+            </w:r>
+          </w:p>
+        </w:tc>
+      </w:tr>
     </w:tbl>
+    <w:p>
+      <w:pPr>
+        <w:spacing w:after="120" w:before="80"/>
+      </w:pPr>
+      <w:r>
+        <w:rPr>
+          <w:rFonts w:ascii="Arial" w:cs="Arial" w:eastAsia="Arial" w:hAnsi="Arial"/>
+          <w:i/>
+          <w:iCs/>
+          <w:color w:val="595959"/>
+          <w:sz w:val="18"/>
+          <w:szCs w:val="18"/>
+        </w:rPr>
+        <w:t xml:space="preserve">* profiles and feedback are separate modules that share one test suite (test_profiles_feedback.py, 48 tests). Module test counts sum to 569 across the twelve modules (verification = risk_classifier 59 + intent_governance 39 + invariant_guard 42 + governed_actuator 16).</w:t>
+      </w:r>
+    </w:p>
     <w:p>
       <w:pPr>
         <w:pBdr>
@@ -1267,7 +1639,7 @@
           <w:sz w:val="22"/>
           <w:szCs w:val="22"/>
         </w:rPr>
-        <w:t xml:space="preserve">The consistency probe implements a practical analog to H-neuron detection from recent interpretability research (Tsinghua University, 2025). It identifies the dangerous quadrant: high confidence combined with low consistency across prompt variations. Rather than profiling by model class, it builds a behavioral fingerprint from measured performance. Hard safety thresholds apply universally regardless of model size. Anomaly detection uses each model's own historical baseline to reduce false positives on less capable hardware.</w:t>
+        <w:t xml:space="preserve">The consistency probe implements a practical analog to H-neuron detection from recent interpretability research (Tsinghua University, 2025; arXiv:2512.01797). It is a black-box behavioral approximation, not neuron-level access: it identifies the dangerous quadrant: high confidence combined with low consistency across prompt variations. Rather than profiling by model class, it builds a behavioral fingerprint from measured performance. Hard safety thresholds apply universally regardless of model size. Anomaly detection uses each model's own historical baseline to reduce false positives on less capable hardware.</w:t>
       </w:r>
     </w:p>
     <w:p>
@@ -1562,7 +1934,7 @@
           <w:sz w:val="22"/>
           <w:szCs w:val="22"/>
         </w:rPr>
-        <w:t xml:space="preserve">H-neuron detection methodology (Tsinghua University, 2025) — implemented in the consistency probe module</w:t>
+        <w:t xml:space="preserve">H-neuron research (Tsinghua University, 2025; arXiv:2512.01797) — inspired the behavioral consistency probe, which approximates the idea with black-box confidence/consistency signals rather than neuron-level access</w:t>
       </w:r>
     </w:p>
     <w:p>

</xml_diff>

<commit_message>
chore: apply v4.3.0 — Uncertainty Engine update
New files:
- driftcore/verification/uncertainty.py (UncertaintyEngine + GovernanceMemory)
- driftcore/verification/edge_loop.py (human-ratified learning loop)
- driftcore/verification/ledger.py (shared append-only hash-chained ledger)
- test_uncertainty_engine.py
- test_edge_loop.py
- test_ledger.py

Modified files:
- driftcore/verification/coordinator.py (optional uncertainty gate added)
- driftcore/__init__.py
- CHANGELOG.md, CLAUDE.md, CONSTITUTION.md, CONTRIBUTING.md
- DRIFTCORE.md, README.md, REVIEW_PHASE_B.md, SAFETY_CONTRACT.md
- docs/DriftCore_Technical_Architecture.docx
- stages/03_safety_review/CONTEXT.md
</commit_message>
<xml_diff>
--- a/docs/DriftCore_Technical_Architecture.docx
+++ b/docs/DriftCore_Technical_Architecture.docx
@@ -16,7 +16,7 @@
           <w:sz w:val="48"/>
           <w:szCs w:val="48"/>
         </w:rPr>
-        <w:t xml:space="preserve">DriftCore OS v4.2.0</w:t>
+        <w:t xml:space="preserve">DriftCore OS v4.3.0</w:t>
       </w:r>
     </w:p>
     <w:p>
@@ -48,7 +48,7 @@
           <w:sz w:val="20"/>
           <w:szCs w:val="20"/>
         </w:rPr>
-        <w:t xml:space="preserve">569 Tests  |  12 Safety Modules  |  Open Source</w:t>
+        <w:t xml:space="preserve">625 Tests  |  12 Safety Modules  |  Open Source</w:t>
       </w:r>
     </w:p>
     <w:p>
@@ -178,7 +178,7 @@
           <w:sz w:val="22"/>
           <w:szCs w:val="22"/>
         </w:rPr>
-        <w:t xml:space="preserve">DriftCore v4.2.0 comprises twelve production modules with 569 automated tests:</w:t>
+        <w:t xml:space="preserve">DriftCore v4.3.0 comprises twelve production modules with 625 automated tests:</w:t>
       </w:r>
     </w:p>
     <w:tbl>
@@ -1328,7 +1328,7 @@
                 <w:sz w:val="20"/>
                 <w:szCs w:val="20"/>
               </w:rPr>
-              <w:t xml:space="preserve">Risk classification, intent, guard, coordinator, governed actuator; explainable, evasion-tested</w:t>
+              <w:t xml:space="preserve">Risk classification, intent, guard, coordinator, governed actuator, uncertainty, edge loop, ledger; explainable, evasion-tested</w:t>
             </w:r>
           </w:p>
         </w:tc>
@@ -1356,7 +1356,7 @@
                 <w:sz w:val="20"/>
                 <w:szCs w:val="20"/>
               </w:rPr>
-              <w:t xml:space="preserve">59 + 39 + 42 + 16</w:t>
+              <w:t xml:space="preserve">59 + 39 + 42 + 16 + 25 + 21 + 10</w:t>
             </w:r>
           </w:p>
         </w:tc>
@@ -1375,7 +1375,7 @@
           <w:sz w:val="18"/>
           <w:szCs w:val="18"/>
         </w:rPr>
-        <w:t xml:space="preserve">* profiles and feedback are separate modules that share one test suite (test_profiles_feedback.py, 48 tests). Module test counts sum to 569 across the twelve modules (verification = risk_classifier 59 + intent_governance 39 + invariant_guard 42 + governed_actuator 16).</w:t>
+        <w:t xml:space="preserve">* profiles and feedback are separate modules that share one test suite (test_profiles_feedback.py, 48 tests). Module test counts sum to 625 across the twelve modules (verification = risk_classifier 59 + intent_governance 39 + invariant_guard 42 + governed_actuator 16 + uncertainty 25 + edge_loop 21 + ledger 10).</w:t>
       </w:r>
     </w:p>
     <w:p>

</xml_diff>

<commit_message>
Integrated update 2026-06-27: new modules, docs, tests, and safety architecture
</commit_message>
<xml_diff>
--- a/docs/DriftCore_Technical_Architecture.docx
+++ b/docs/DriftCore_Technical_Architecture.docx
@@ -16,7 +16,7 @@
           <w:sz w:val="48"/>
           <w:szCs w:val="48"/>
         </w:rPr>
-        <w:t xml:space="preserve">DriftCore OS v4.3.0</w:t>
+        <w:t xml:space="preserve">DriftCore OS v3.9</w:t>
       </w:r>
     </w:p>
     <w:p>
@@ -48,7 +48,7 @@
           <w:sz w:val="20"/>
           <w:szCs w:val="20"/>
         </w:rPr>
-        <w:t xml:space="preserve">625 Tests  |  12 Safety Modules  |  Open Source</w:t>
+        <w:t xml:space="preserve">343 Tests  |  8 Safety Modules  |  Open Source</w:t>
       </w:r>
     </w:p>
     <w:p>
@@ -178,7 +178,7 @@
           <w:sz w:val="22"/>
           <w:szCs w:val="22"/>
         </w:rPr>
-        <w:t xml:space="preserve">DriftCore v4.3.0 comprises twelve production modules with 625 automated tests:</w:t>
+        <w:t xml:space="preserve">DriftCore v3.9 comprises eight production modules with 343 automated tests:</w:t>
       </w:r>
     </w:p>
     <w:tbl>
@@ -377,7 +377,7 @@
                 <w:sz w:val="20"/>
                 <w:szCs w:val="20"/>
               </w:rPr>
-              <w:t xml:space="preserve">15 + 35</w:t>
+              <w:t xml:space="preserve">15 + 49</w:t>
             </w:r>
           </w:p>
         </w:tc>
@@ -1005,379 +1005,7 @@
           </w:p>
         </w:tc>
       </w:tr>
-      <w:tr>
-        <w:tc>
-          <w:tcPr>
-            <w:tcW w:type="dxa" w:w="2400"/>
-            <w:tcBorders>
-              <w:top w:val="single" w:color="CCCCCC" w:sz="1"/>
-              <w:left w:val="single" w:color="CCCCCC" w:sz="1"/>
-              <w:bottom w:val="single" w:color="CCCCCC" w:sz="1"/>
-              <w:right w:val="single" w:color="CCCCCC" w:sz="1"/>
-            </w:tcBorders>
-            <w:shd w:fill="F2F9FF" w:val="clear"/>
-            <w:tcMar>
-              <w:top w:type="dxa" w:w="80"/>
-              <w:left w:type="dxa" w:w="120"/>
-              <w:bottom w:type="dxa" w:w="80"/>
-              <w:right w:type="dxa" w:w="120"/>
-            </w:tcMar>
-          </w:tcPr>
-          <w:p>
-            <w:r>
-              <w:rPr>
-                <w:rFonts w:ascii="Arial" w:cs="Arial" w:eastAsia="Arial" w:hAnsi="Arial"/>
-                <w:b/>
-                <w:bCs/>
-                <w:color w:val="1B4F72"/>
-                <w:sz w:val="20"/>
-                <w:szCs w:val="20"/>
-              </w:rPr>
-              <w:t xml:space="preserve">api</w:t>
-            </w:r>
-          </w:p>
-        </w:tc>
-        <w:tc>
-          <w:tcPr>
-            <w:tcW w:type="dxa" w:w="3960"/>
-            <w:tcBorders>
-              <w:top w:val="single" w:color="CCCCCC" w:sz="1"/>
-              <w:left w:val="single" w:color="CCCCCC" w:sz="1"/>
-              <w:bottom w:val="single" w:color="CCCCCC" w:sz="1"/>
-              <w:right w:val="single" w:color="CCCCCC" w:sz="1"/>
-            </w:tcBorders>
-            <w:shd w:fill="FFFFFF" w:val="clear"/>
-            <w:tcMar>
-              <w:top w:type="dxa" w:w="80"/>
-              <w:left w:type="dxa" w:w="120"/>
-              <w:bottom w:type="dxa" w:w="80"/>
-              <w:right w:type="dxa" w:w="120"/>
-            </w:tcMar>
-          </w:tcPr>
-          <w:p>
-            <w:r>
-              <w:rPr>
-                <w:rFonts w:ascii="Arial" w:cs="Arial" w:eastAsia="Arial" w:hAnsi="Arial"/>
-                <w:sz w:val="20"/>
-                <w:szCs w:val="20"/>
-              </w:rPr>
-              <w:t xml:space="preserve">Universal agent/device interface — every action audited, every write gated</w:t>
-            </w:r>
-          </w:p>
-        </w:tc>
-        <w:tc>
-          <w:tcPr>
-            <w:tcW w:type="dxa" w:w="3000"/>
-            <w:tcBorders>
-              <w:top w:val="single" w:color="CCCCCC" w:sz="1"/>
-              <w:left w:val="single" w:color="CCCCCC" w:sz="1"/>
-              <w:bottom w:val="single" w:color="CCCCCC" w:sz="1"/>
-              <w:right w:val="single" w:color="CCCCCC" w:sz="1"/>
-            </w:tcBorders>
-            <w:shd w:fill="FFFFFF" w:val="clear"/>
-            <w:tcMar>
-              <w:top w:type="dxa" w:w="80"/>
-              <w:left w:type="dxa" w:w="120"/>
-              <w:bottom w:type="dxa" w:w="80"/>
-              <w:right w:type="dxa" w:w="120"/>
-            </w:tcMar>
-          </w:tcPr>
-          <w:p>
-            <w:r>
-              <w:rPr>
-                <w:rFonts w:ascii="Arial" w:cs="Arial" w:eastAsia="Arial" w:hAnsi="Arial"/>
-                <w:sz w:val="20"/>
-                <w:szCs w:val="20"/>
-              </w:rPr>
-              <w:t xml:space="preserve">36</w:t>
-            </w:r>
-          </w:p>
-        </w:tc>
-      </w:tr>
-      <w:tr>
-        <w:tc>
-          <w:tcPr>
-            <w:tcW w:type="dxa" w:w="2400"/>
-            <w:tcBorders>
-              <w:top w:val="single" w:color="CCCCCC" w:sz="1"/>
-              <w:left w:val="single" w:color="CCCCCC" w:sz="1"/>
-              <w:bottom w:val="single" w:color="CCCCCC" w:sz="1"/>
-              <w:right w:val="single" w:color="CCCCCC" w:sz="1"/>
-            </w:tcBorders>
-            <w:shd w:fill="F2F9FF" w:val="clear"/>
-            <w:tcMar>
-              <w:top w:type="dxa" w:w="80"/>
-              <w:left w:type="dxa" w:w="120"/>
-              <w:bottom w:type="dxa" w:w="80"/>
-              <w:right w:type="dxa" w:w="120"/>
-            </w:tcMar>
-          </w:tcPr>
-          <w:p>
-            <w:r>
-              <w:rPr>
-                <w:rFonts w:ascii="Arial" w:cs="Arial" w:eastAsia="Arial" w:hAnsi="Arial"/>
-                <w:b/>
-                <w:bCs/>
-                <w:color w:val="1B4F72"/>
-                <w:sz w:val="20"/>
-                <w:szCs w:val="20"/>
-              </w:rPr>
-              <w:t xml:space="preserve">profiles</w:t>
-            </w:r>
-          </w:p>
-        </w:tc>
-        <w:tc>
-          <w:tcPr>
-            <w:tcW w:type="dxa" w:w="3960"/>
-            <w:tcBorders>
-              <w:top w:val="single" w:color="CCCCCC" w:sz="1"/>
-              <w:left w:val="single" w:color="CCCCCC" w:sz="1"/>
-              <w:bottom w:val="single" w:color="CCCCCC" w:sz="1"/>
-              <w:right w:val="single" w:color="CCCCCC" w:sz="1"/>
-            </w:tcBorders>
-            <w:shd w:fill="FFFFFF" w:val="clear"/>
-            <w:tcMar>
-              <w:top w:type="dxa" w:w="80"/>
-              <w:left w:type="dxa" w:w="120"/>
-              <w:bottom w:type="dxa" w:w="80"/>
-              <w:right w:type="dxa" w:w="120"/>
-            </w:tcMar>
-          </w:tcPr>
-          <w:p>
-            <w:r>
-              <w:rPr>
-                <w:rFonts w:ascii="Arial" w:cs="Arial" w:eastAsia="Arial" w:hAnsi="Arial"/>
-                <w:sz w:val="20"/>
-                <w:szCs w:val="20"/>
-              </w:rPr>
-              <w:t xml:space="preserve">Deployment profiles per context (home, medical, call center, accounting, admin)</w:t>
-            </w:r>
-          </w:p>
-        </w:tc>
-        <w:tc>
-          <w:tcPr>
-            <w:tcW w:type="dxa" w:w="3000"/>
-            <w:tcBorders>
-              <w:top w:val="single" w:color="CCCCCC" w:sz="1"/>
-              <w:left w:val="single" w:color="CCCCCC" w:sz="1"/>
-              <w:bottom w:val="single" w:color="CCCCCC" w:sz="1"/>
-              <w:right w:val="single" w:color="CCCCCC" w:sz="1"/>
-            </w:tcBorders>
-            <w:shd w:fill="FFFFFF" w:val="clear"/>
-            <w:tcMar>
-              <w:top w:type="dxa" w:w="80"/>
-              <w:left w:type="dxa" w:w="120"/>
-              <w:bottom w:type="dxa" w:w="80"/>
-              <w:right w:type="dxa" w:w="120"/>
-            </w:tcMar>
-          </w:tcPr>
-          <w:p>
-            <w:r>
-              <w:rPr>
-                <w:rFonts w:ascii="Arial" w:cs="Arial" w:eastAsia="Arial" w:hAnsi="Arial"/>
-                <w:sz w:val="20"/>
-                <w:szCs w:val="20"/>
-              </w:rPr>
-              <w:t xml:space="preserve">48*</w:t>
-            </w:r>
-          </w:p>
-        </w:tc>
-      </w:tr>
-      <w:tr>
-        <w:tc>
-          <w:tcPr>
-            <w:tcW w:type="dxa" w:w="2400"/>
-            <w:tcBorders>
-              <w:top w:val="single" w:color="CCCCCC" w:sz="1"/>
-              <w:left w:val="single" w:color="CCCCCC" w:sz="1"/>
-              <w:bottom w:val="single" w:color="CCCCCC" w:sz="1"/>
-              <w:right w:val="single" w:color="CCCCCC" w:sz="1"/>
-            </w:tcBorders>
-            <w:shd w:fill="F2F9FF" w:val="clear"/>
-            <w:tcMar>
-              <w:top w:type="dxa" w:w="80"/>
-              <w:left w:type="dxa" w:w="120"/>
-              <w:bottom w:type="dxa" w:w="80"/>
-              <w:right w:type="dxa" w:w="120"/>
-            </w:tcMar>
-          </w:tcPr>
-          <w:p>
-            <w:r>
-              <w:rPr>
-                <w:rFonts w:ascii="Arial" w:cs="Arial" w:eastAsia="Arial" w:hAnsi="Arial"/>
-                <w:b/>
-                <w:bCs/>
-                <w:color w:val="1B4F72"/>
-                <w:sz w:val="20"/>
-                <w:szCs w:val="20"/>
-              </w:rPr>
-              <w:t xml:space="preserve">feedback</w:t>
-            </w:r>
-          </w:p>
-        </w:tc>
-        <w:tc>
-          <w:tcPr>
-            <w:tcW w:type="dxa" w:w="3960"/>
-            <w:tcBorders>
-              <w:top w:val="single" w:color="CCCCCC" w:sz="1"/>
-              <w:left w:val="single" w:color="CCCCCC" w:sz="1"/>
-              <w:bottom w:val="single" w:color="CCCCCC" w:sz="1"/>
-              <w:right w:val="single" w:color="CCCCCC" w:sz="1"/>
-            </w:tcBorders>
-            <w:shd w:fill="FFFFFF" w:val="clear"/>
-            <w:tcMar>
-              <w:top w:type="dxa" w:w="80"/>
-              <w:left w:type="dxa" w:w="120"/>
-              <w:bottom w:type="dxa" w:w="80"/>
-              <w:right w:type="dxa" w:w="120"/>
-            </w:tcMar>
-          </w:tcPr>
-          <w:p>
-            <w:r>
-              <w:rPr>
-                <w:rFonts w:ascii="Arial" w:cs="Arial" w:eastAsia="Arial" w:hAnsi="Arial"/>
-                <w:sz w:val="20"/>
-                <w:szCs w:val="20"/>
-              </w:rPr>
-              <w:t xml:space="preserve">Bottom-up user feedback loop; admin approves changes</w:t>
-            </w:r>
-          </w:p>
-        </w:tc>
-        <w:tc>
-          <w:tcPr>
-            <w:tcW w:type="dxa" w:w="3000"/>
-            <w:tcBorders>
-              <w:top w:val="single" w:color="CCCCCC" w:sz="1"/>
-              <w:left w:val="single" w:color="CCCCCC" w:sz="1"/>
-              <w:bottom w:val="single" w:color="CCCCCC" w:sz="1"/>
-              <w:right w:val="single" w:color="CCCCCC" w:sz="1"/>
-            </w:tcBorders>
-            <w:shd w:fill="FFFFFF" w:val="clear"/>
-            <w:tcMar>
-              <w:top w:type="dxa" w:w="80"/>
-              <w:left w:type="dxa" w:w="120"/>
-              <w:bottom w:type="dxa" w:w="80"/>
-              <w:right w:type="dxa" w:w="120"/>
-            </w:tcMar>
-          </w:tcPr>
-          <w:p>
-            <w:r>
-              <w:rPr>
-                <w:rFonts w:ascii="Arial" w:cs="Arial" w:eastAsia="Arial" w:hAnsi="Arial"/>
-                <w:sz w:val="20"/>
-                <w:szCs w:val="20"/>
-              </w:rPr>
-              <w:t xml:space="preserve">shared*</w:t>
-            </w:r>
-          </w:p>
-        </w:tc>
-      </w:tr>
-      <w:tr>
-        <w:tc>
-          <w:tcPr>
-            <w:tcW w:type="dxa" w:w="2400"/>
-            <w:tcBorders>
-              <w:top w:val="single" w:color="CCCCCC" w:sz="1"/>
-              <w:left w:val="single" w:color="CCCCCC" w:sz="1"/>
-              <w:bottom w:val="single" w:color="CCCCCC" w:sz="1"/>
-              <w:right w:val="single" w:color="CCCCCC" w:sz="1"/>
-            </w:tcBorders>
-            <w:shd w:fill="F2F9FF" w:val="clear"/>
-            <w:tcMar>
-              <w:top w:type="dxa" w:w="80"/>
-              <w:left w:type="dxa" w:w="120"/>
-              <w:bottom w:type="dxa" w:w="80"/>
-              <w:right w:type="dxa" w:w="120"/>
-            </w:tcMar>
-          </w:tcPr>
-          <w:p>
-            <w:r>
-              <w:rPr>
-                <w:rFonts w:ascii="Arial" w:cs="Arial" w:eastAsia="Arial" w:hAnsi="Arial"/>
-                <w:b/>
-                <w:bCs/>
-                <w:color w:val="1B4F72"/>
-                <w:sz w:val="20"/>
-                <w:szCs w:val="20"/>
-              </w:rPr>
-              <w:t xml:space="preserve">verification</w:t>
-            </w:r>
-          </w:p>
-        </w:tc>
-        <w:tc>
-          <w:tcPr>
-            <w:tcW w:type="dxa" w:w="3960"/>
-            <w:tcBorders>
-              <w:top w:val="single" w:color="CCCCCC" w:sz="1"/>
-              <w:left w:val="single" w:color="CCCCCC" w:sz="1"/>
-              <w:bottom w:val="single" w:color="CCCCCC" w:sz="1"/>
-              <w:right w:val="single" w:color="CCCCCC" w:sz="1"/>
-            </w:tcBorders>
-            <w:shd w:fill="FFFFFF" w:val="clear"/>
-            <w:tcMar>
-              <w:top w:type="dxa" w:w="80"/>
-              <w:left w:type="dxa" w:w="120"/>
-              <w:bottom w:type="dxa" w:w="80"/>
-              <w:right w:type="dxa" w:w="120"/>
-            </w:tcMar>
-          </w:tcPr>
-          <w:p>
-            <w:r>
-              <w:rPr>
-                <w:rFonts w:ascii="Arial" w:cs="Arial" w:eastAsia="Arial" w:hAnsi="Arial"/>
-                <w:sz w:val="20"/>
-                <w:szCs w:val="20"/>
-              </w:rPr>
-              <w:t xml:space="preserve">Risk classification, intent, guard, coordinator, governed actuator, uncertainty, edge loop, ledger; explainable, evasion-tested</w:t>
-            </w:r>
-          </w:p>
-        </w:tc>
-        <w:tc>
-          <w:tcPr>
-            <w:tcW w:type="dxa" w:w="3000"/>
-            <w:tcBorders>
-              <w:top w:val="single" w:color="CCCCCC" w:sz="1"/>
-              <w:left w:val="single" w:color="CCCCCC" w:sz="1"/>
-              <w:bottom w:val="single" w:color="CCCCCC" w:sz="1"/>
-              <w:right w:val="single" w:color="CCCCCC" w:sz="1"/>
-            </w:tcBorders>
-            <w:shd w:fill="FFFFFF" w:val="clear"/>
-            <w:tcMar>
-              <w:top w:type="dxa" w:w="80"/>
-              <w:left w:type="dxa" w:w="120"/>
-              <w:bottom w:type="dxa" w:w="80"/>
-              <w:right w:type="dxa" w:w="120"/>
-            </w:tcMar>
-          </w:tcPr>
-          <w:p>
-            <w:r>
-              <w:rPr>
-                <w:rFonts w:ascii="Arial" w:cs="Arial" w:eastAsia="Arial" w:hAnsi="Arial"/>
-                <w:sz w:val="20"/>
-                <w:szCs w:val="20"/>
-              </w:rPr>
-              <w:t xml:space="preserve">59 + 39 + 42 + 16 + 25 + 21 + 10</w:t>
-            </w:r>
-          </w:p>
-        </w:tc>
-      </w:tr>
     </w:tbl>
-    <w:p>
-      <w:pPr>
-        <w:spacing w:after="120" w:before="80"/>
-      </w:pPr>
-      <w:r>
-        <w:rPr>
-          <w:rFonts w:ascii="Arial" w:cs="Arial" w:eastAsia="Arial" w:hAnsi="Arial"/>
-          <w:i/>
-          <w:iCs/>
-          <w:color w:val="595959"/>
-          <w:sz w:val="18"/>
-          <w:szCs w:val="18"/>
-        </w:rPr>
-        <w:t xml:space="preserve">* profiles and feedback are separate modules that share one test suite (test_profiles_feedback.py, 48 tests). Module test counts sum to 625 across the twelve modules (verification = risk_classifier 59 + intent_governance 39 + invariant_guard 42 + governed_actuator 16 + uncertainty 25 + edge_loop 21 + ledger 10).</w:t>
-      </w:r>
-    </w:p>
     <w:p>
       <w:pPr>
         <w:pBdr>
@@ -1639,7 +1267,7 @@
           <w:sz w:val="22"/>
           <w:szCs w:val="22"/>
         </w:rPr>
-        <w:t xml:space="preserve">The consistency probe implements a practical analog to H-neuron detection from recent interpretability research (Tsinghua University, 2025; arXiv:2512.01797). It is a black-box behavioral approximation, not neuron-level access: it identifies the dangerous quadrant: high confidence combined with low consistency across prompt variations. Rather than profiling by model class, it builds a behavioral fingerprint from measured performance. Hard safety thresholds apply universally regardless of model size. Anomaly detection uses each model's own historical baseline to reduce false positives on less capable hardware.</w:t>
+        <w:t xml:space="preserve">The consistency probe implements a practical analog to H-neuron detection from recent interpretability research (Tsinghua University, 2025). It identifies the dangerous quadrant: high confidence combined with low consistency across prompt variations. Rather than profiling by model class, it builds a behavioral fingerprint from measured performance. Hard safety thresholds apply universally regardless of model size. Anomaly detection uses each model's own historical baseline to reduce false positives on less capable hardware.</w:t>
       </w:r>
     </w:p>
     <w:p>
@@ -1934,7 +1562,7 @@
           <w:sz w:val="22"/>
           <w:szCs w:val="22"/>
         </w:rPr>
-        <w:t xml:space="preserve">H-neuron research (Tsinghua University, 2025; arXiv:2512.01797) — inspired the behavioral consistency probe, which approximates the idea with black-box confidence/consistency signals rather than neuron-level access</w:t>
+        <w:t xml:space="preserve">H-neuron detection methodology (Tsinghua University, 2025) — implemented in the consistency probe module</w:t>
       </w:r>
     </w:p>
     <w:p>

</xml_diff>